<commit_message>
Fire package rebuilt after the editorial pre-check
</commit_message>
<xml_diff>
--- a/paper/submission_fire/cover_letter_draft.docx
+++ b/paper/submission_fire/cover_letter_draft.docx
@@ -94,61 +94,61 @@
         <w:pStyle w:val="BodyText"/>
       </w:pPr>
       <w:r>
-        <w:t xml:space="preserve">Wildfire susceptibility models built from satellite predictors are usually validated in the region</w:t>
-      </w:r>
-      <w:r>
-        <w:t xml:space="preserve"> </w:t>
-      </w:r>
-      <w:r>
-        <w:t xml:space="preserve">where they were trained, and their skill in other regions is rarely measured. We added six pre-fire</w:t>
-      </w:r>
-      <w:r>
-        <w:t xml:space="preserve"> </w:t>
-      </w:r>
-      <w:r>
-        <w:t xml:space="preserve">land surface temperature and dryness predictors from Landsat and MODIS to a static baseline, trained</w:t>
-      </w:r>
-      <w:r>
-        <w:t xml:space="preserve"> </w:t>
-      </w:r>
-      <w:r>
-        <w:t xml:space="preserve">random forests in five Mediterranean regions with one large fire season each (Manavgat and Muğla,</w:t>
-      </w:r>
-      <w:r>
-        <w:t xml:space="preserve"> </w:t>
-      </w:r>
-      <w:r>
-        <w:t xml:space="preserve">Türkiye; Bejís, Spain; North Evia, Greece; Montiferru, Italy), and measured two things that are</w:t>
-      </w:r>
-      <w:r>
-        <w:t xml:space="preserve"> </w:t>
-      </w:r>
-      <w:r>
-        <w:t xml:space="preserve">usually assumed. First, the evaluation area changes the score: the same model lost 0.160 ROC-AUC</w:t>
-      </w:r>
-      <w:r>
-        <w:t xml:space="preserve"> </w:t>
-      </w:r>
-      <w:r>
-        <w:t xml:space="preserve">when it was scored on the burn scar and a 2 km collar instead of the whole study area. Second, local</w:t>
-      </w:r>
-      <w:r>
-        <w:t xml:space="preserve"> </w:t>
-      </w:r>
-      <w:r>
-        <w:t xml:space="preserve">skill transferred at most weakly: the thermal predictors added +0.045 to +0.148 within regions but</w:t>
-      </w:r>
-      <w:r>
-        <w:t xml:space="preserve"> </w:t>
-      </w:r>
-      <w:r>
-        <w:t xml:space="preserve">only +0.007 across twenty transfer directions, and none of twenty similarity measures predicted</w:t>
-      </w:r>
-      <w:r>
-        <w:t xml:space="preserve"> </w:t>
-      </w:r>
-      <w:r>
-        <w:t xml:space="preserve">which transfers would work.</w:t>
+        <w:t xml:space="preserve">Fire agencies in regions without a long burned-area record often have to use susceptibility models</w:t>
+      </w:r>
+      <w:r>
+        <w:t xml:space="preserve"> </w:t>
+      </w:r>
+      <w:r>
+        <w:t xml:space="preserve">built elsewhere, yet such models are almost always validated only in the region where they were</w:t>
+      </w:r>
+      <w:r>
+        <w:t xml:space="preserve"> </w:t>
+      </w:r>
+      <w:r>
+        <w:t xml:space="preserve">trained. We tested this directly for five large Mediterranean fire seasons of 2021 and 2022 (Manavgat</w:t>
+      </w:r>
+      <w:r>
+        <w:t xml:space="preserve"> </w:t>
+      </w:r>
+      <w:r>
+        <w:t xml:space="preserve">and Muğla, Türkiye; Bejís, Spain; North Evia, Greece; Montiferru, Italy). Pre-fire satellite land</w:t>
+      </w:r>
+      <w:r>
+        <w:t xml:space="preserve"> </w:t>
+      </w:r>
+      <w:r>
+        <w:t xml:space="preserve">surface temperature and dryness predictors improved random-forest susceptibility within every region</w:t>
+      </w:r>
+      <w:r>
+        <w:t xml:space="preserve"> </w:t>
+      </w:r>
+      <w:r>
+        <w:t xml:space="preserve">(+0.045 to +0.148 ROC-AUC), but the gain carried to other regions was close to zero (+0.007), and no</w:t>
+      </w:r>
+      <w:r>
+        <w:t xml:space="preserve"> </w:t>
+      </w:r>
+      <w:r>
+        <w:t xml:space="preserve">similarity measure told in advance which transfers would work. The paper also shows that the area on</w:t>
+      </w:r>
+      <w:r>
+        <w:t xml:space="preserve"> </w:t>
+      </w:r>
+      <w:r>
+        <w:t xml:space="preserve">which a model is scored changes its apparent skill substantially, and that pre-fire land surface</w:t>
+      </w:r>
+      <w:r>
+        <w:t xml:space="preserve"> </w:t>
+      </w:r>
+      <w:r>
+        <w:t xml:space="preserve">temperature behaved as a descriptor of the land surface rather than as a dryness signal: hotter</w:t>
+      </w:r>
+      <w:r>
+        <w:t xml:space="preserve"> </w:t>
+      </w:r>
+      <w:r>
+        <w:t xml:space="preserve">surfaces burned less in four of the five regions.</w:t>
       </w:r>
     </w:p>
     <w:p>
@@ -172,31 +172,65 @@
         <w:t xml:space="preserve"> </w:t>
       </w:r>
       <w:r>
-        <w:t xml:space="preserve">because it concerns the science and technology of fire</w:t>
-      </w:r>
-      <w:r>
-        <w:t xml:space="preserve"> </w:t>
-      </w:r>
-      <w:r>
-        <w:t xml:space="preserve">susceptibility mapping: how pre-fire satellite observations of the land surface relate to where fires</w:t>
-      </w:r>
-      <w:r>
-        <w:t xml:space="preserve"> </w:t>
-      </w:r>
-      <w:r>
-        <w:t xml:space="preserve">burn, and how such models should be evaluated before fire managers use a model built in another</w:t>
-      </w:r>
-      <w:r>
-        <w:t xml:space="preserve"> </w:t>
-      </w:r>
-      <w:r>
-        <w:t xml:space="preserve">region. All satellite inputs are public, and the analysis code, the modelling datasets and the frozen</w:t>
-      </w:r>
-      <w:r>
-        <w:t xml:space="preserve"> </w:t>
-      </w:r>
-      <w:r>
-        <w:t xml:space="preserve">outputs behind every reported number are archived at Zenodo, so every result can be re-run.</w:t>
+        <w:t xml:space="preserve">because it concerns how fire susceptibility maps, which serve</w:t>
+      </w:r>
+      <w:r>
+        <w:t xml:space="preserve"> </w:t>
+      </w:r>
+      <w:r>
+        <w:t xml:space="preserve">prevention planning, should be evaluated before they are used in a new region. It builds on</w:t>
+      </w:r>
+      <w:r>
+        <w:t xml:space="preserve"> </w:t>
+      </w:r>
+      <w:r>
+        <w:t xml:space="preserve">susceptibility and fuel-moisture work published in</w:t>
+      </w:r>
+      <w:r>
+        <w:t xml:space="preserve"> </w:t>
+      </w:r>
+      <w:r>
+        <w:rPr>
+          <w:i/>
+          <w:iCs/>
+        </w:rPr>
+        <w:t xml:space="preserve">Fire</w:t>
+      </w:r>
+      <w:r>
+        <w:t xml:space="preserve"> </w:t>
+      </w:r>
+      <w:r>
+        <w:t xml:space="preserve">(Trucchia et al., 2022; Marino et al., 2024)</w:t>
+      </w:r>
+      <w:r>
+        <w:t xml:space="preserve"> </w:t>
+      </w:r>
+      <w:r>
+        <w:t xml:space="preserve">and complements weather-driven danger rating such as the Fire Weather Index used by EFFIS, by isolating</w:t>
+      </w:r>
+      <w:r>
+        <w:t xml:space="preserve"> </w:t>
+      </w:r>
+      <w:r>
+        <w:t xml:space="preserve">the pre-fire surface component. Each region contributes one fire season, and we state throughout that</w:t>
+      </w:r>
+      <w:r>
+        <w:t xml:space="preserve"> </w:t>
+      </w:r>
+      <w:r>
+        <w:t xml:space="preserve">the results describe large single-season events. All satellite inputs are public, and the analysis</w:t>
+      </w:r>
+      <w:r>
+        <w:t xml:space="preserve"> </w:t>
+      </w:r>
+      <w:r>
+        <w:t xml:space="preserve">code, the modelling datasets and the frozen outputs behind every reported number are archived at</w:t>
+      </w:r>
+      <w:r>
+        <w:t xml:space="preserve"> </w:t>
+      </w:r>
+      <w:r>
+        <w:t xml:space="preserve">Zenodo, so every result can be re-run.</w:t>
       </w:r>
     </w:p>
     <w:p>

</xml_diff>